<commit_message>
Revision after external review: Cross & Vesely reading and launch variants by starting knowledge, K_need infeasible case, admissibility screen first (Table 6, Fig. 8), hard exposure limit, tuned threshold baseline and ablations, replicated and closed-loop estimation
</commit_message>
<xml_diff>
--- a/supplementary/KMC_Supplementary_S1_Application_Guide.docx
+++ b/supplementary/KMC_Supplementary_S1_Application_Guide.docx
@@ -770,7 +770,7 @@
                 <w:sz w:val="19"/>
                 <w:szCs w:val="19"/>
               </w:rPr>
-              <w:t xml:space="preserve">Table 6, steps 3–6; Fig. 8</w:t>
+              <w:t xml:space="preserve">Table 6, steps 0 and 3–5; Fig. 8</w:t>
             </w:r>
           </w:p>
         </w:tc>
@@ -6234,7 +6234,7 @@
         <w:rPr>
           <w:rFonts w:ascii="Calibri" w:cs="Calibri" w:eastAsia="Calibri" w:hAnsi="Calibri"/>
         </w:rPr>
-        <w:t xml:space="preserve">4.3 The decision at each review (Table 6, steps 3–4)</w:t>
+        <w:t xml:space="preserve">4.3 The decision at each review (Table 6, steps 0 and 3–4)</w:t>
       </w:r>
     </w:p>
     <w:p>
@@ -6250,47 +6250,7 @@
         <w:rPr>
           <w:rFonts w:ascii="Calibri" w:cs="Calibri" w:eastAsia="Calibri" w:hAnsi="Calibri"/>
         </w:rPr>
-        <w:t xml:space="preserve">If M &lt; M</w:t>
-      </w:r>
-      <w:r>
-        <w:rPr>
-          <w:rFonts w:ascii="Calibri" w:cs="Calibri" w:eastAsia="Calibri" w:hAnsi="Calibri"/>
-          <w:vertAlign w:val="subscript"/>
-        </w:rPr>
-        <w:t xml:space="preserve">req</w:t>
-      </w:r>
-      <w:r>
-        <w:rPr>
-          <w:rFonts w:ascii="Calibri" w:cs="Calibri" w:eastAsia="Calibri" w:hAnsi="Calibri"/>
-        </w:rPr>
-        <w:t xml:space="preserve"> and K ≥ K</w:t>
-      </w:r>
-      <w:r>
-        <w:rPr>
-          <w:rFonts w:ascii="Calibri" w:cs="Calibri" w:eastAsia="Calibri" w:hAnsi="Calibri"/>
-          <w:vertAlign w:val="subscript"/>
-        </w:rPr>
-        <w:t xml:space="preserve">test</w:t>
-      </w:r>
-      <w:r>
-        <w:rPr>
-          <w:rFonts w:ascii="Calibri" w:cs="Calibri" w:eastAsia="Calibri" w:hAnsi="Calibri"/>
-        </w:rPr>
-        <w:t xml:space="preserve">: run the </w:t>
-      </w:r>
-      <w:r>
-        <w:rPr>
-          <w:rFonts w:ascii="Calibri" w:cs="Calibri" w:eastAsia="Calibri" w:hAnsi="Calibri"/>
-          <w:b/>
-          <w:bCs/>
-        </w:rPr>
-        <w:t xml:space="preserve">integrated test</w:t>
-      </w:r>
-      <w:r>
-        <w:rPr>
-          <w:rFonts w:ascii="Calibri" w:cs="Calibri" w:eastAsia="Calibri" w:hAnsi="Calibri"/>
-        </w:rPr>
-        <w:t xml:space="preserve"> T (step 3).</w:t>
+        <w:t xml:space="preserve">First screen every candidate activity against cost, schedule and exposure (step 0); the steps below choose only among the admissible ones.</w:t>
       </w:r>
     </w:p>
     <w:p>
@@ -6306,7 +6266,7 @@
         <w:rPr>
           <w:rFonts w:ascii="Calibri" w:cs="Calibri" w:eastAsia="Calibri" w:hAnsi="Calibri"/>
         </w:rPr>
-        <w:t xml:space="preserve">Otherwise (K &lt; K</w:t>
+        <w:t xml:space="preserve">If M &lt; M</w:t>
       </w:r>
       <w:r>
         <w:rPr>
@@ -6319,20 +6279,20 @@
         <w:rPr>
           <w:rFonts w:ascii="Calibri" w:cs="Calibri" w:eastAsia="Calibri" w:hAnsi="Calibri"/>
         </w:rPr>
-        <w:t xml:space="preserve">, K &lt; K</w:t>
+        <w:t xml:space="preserve"> and K ≥ K</w:t>
       </w:r>
       <w:r>
         <w:rPr>
           <w:rFonts w:ascii="Calibri" w:cs="Calibri" w:eastAsia="Calibri" w:hAnsi="Calibri"/>
           <w:vertAlign w:val="subscript"/>
         </w:rPr>
-        <w:t xml:space="preserve">need</w:t>
-      </w:r>
-      <w:r>
-        <w:rPr>
-          <w:rFonts w:ascii="Calibri" w:cs="Calibri" w:eastAsia="Calibri" w:hAnsi="Calibri"/>
-        </w:rPr>
-        <w:t xml:space="preserve">, or the hazard is above the limit, step 3b): run the activity with the largest </w:t>
+        <w:t xml:space="preserve">test</w:t>
+      </w:r>
+      <w:r>
+        <w:rPr>
+          <w:rFonts w:ascii="Calibri" w:cs="Calibri" w:eastAsia="Calibri" w:hAnsi="Calibri"/>
+        </w:rPr>
+        <w:t xml:space="preserve">: run the </w:t>
       </w:r>
       <w:r>
         <w:rPr>
@@ -6340,231 +6300,13 @@
           <w:b/>
           <w:bCs/>
         </w:rPr>
-        <w:t xml:space="preserve">net knowledge rate</w:t>
-      </w:r>
-      <w:r>
-        <w:rPr>
-          <w:rFonts w:ascii="Calibri" w:cs="Calibri" w:eastAsia="Calibri" w:hAnsi="Calibri"/>
-        </w:rPr>
-        <w:t xml:space="preserve"> (step 4):</w:t>
-      </w:r>
-    </w:p>
-    <w:p>
-      <w:pPr>
-        <w:spacing w:after="120" w:before="80"/>
-        <w:jc w:val="center"/>
-      </w:pPr>
-      <w:r>
-        <w:rPr>
-          <w:rFonts w:ascii="Cambria Math" w:cs="Cambria Math" w:eastAsia="Cambria Math" w:hAnsi="Cambria Math"/>
-          <w:sz w:val="23"/>
-          <w:szCs w:val="23"/>
-        </w:rPr>
-        <w:t xml:space="preserve">net</w:t>
-      </w:r>
-      <w:r>
-        <w:rPr>
-          <w:rFonts w:ascii="Cambria Math" w:cs="Cambria Math" w:eastAsia="Cambria Math" w:hAnsi="Cambria Math"/>
-          <w:sz w:val="23"/>
-          <w:szCs w:val="23"/>
-          <w:vertAlign w:val="subscript"/>
-        </w:rPr>
-        <w:t xml:space="preserve">a</w:t>
-      </w:r>
-      <w:r>
-        <w:rPr>
-          <w:rFonts w:ascii="Cambria Math" w:cs="Cambria Math" w:eastAsia="Cambria Math" w:hAnsi="Cambria Math"/>
-          <w:sz w:val="23"/>
-          <w:szCs w:val="23"/>
-        </w:rPr>
-        <w:t xml:space="preserve"> = F</w:t>
-      </w:r>
-      <w:r>
-        <w:rPr>
-          <w:rFonts w:ascii="Cambria Math" w:cs="Cambria Math" w:eastAsia="Cambria Math" w:hAnsi="Cambria Math"/>
-          <w:sz w:val="23"/>
-          <w:szCs w:val="23"/>
-          <w:vertAlign w:val="subscript"/>
-        </w:rPr>
-        <w:t xml:space="preserve">a</w:t>
-      </w:r>
-      <w:r>
-        <w:rPr>
-          <w:rFonts w:ascii="Cambria Math" w:cs="Cambria Math" w:eastAsia="Cambria Math" w:hAnsi="Cambria Math"/>
-          <w:sz w:val="23"/>
-          <w:szCs w:val="23"/>
-        </w:rPr>
-        <w:t xml:space="preserve">(K, M) − λ</w:t>
-      </w:r>
-      <w:r>
-        <w:rPr>
-          <w:rFonts w:ascii="Cambria Math" w:cs="Cambria Math" w:eastAsia="Cambria Math" w:hAnsi="Cambria Math"/>
-          <w:sz w:val="23"/>
-          <w:szCs w:val="23"/>
-          <w:vertAlign w:val="subscript"/>
-        </w:rPr>
-        <w:t xml:space="preserve">a</w:t>
-      </w:r>
-      <w:r>
-        <w:rPr>
-          <w:rFonts w:ascii="Cambria Math" w:cs="Cambria Math" w:eastAsia="Cambria Math" w:hAnsi="Cambria Math"/>
-          <w:sz w:val="23"/>
-          <w:szCs w:val="23"/>
-        </w:rPr>
-        <w:t xml:space="preserve">(1 − K)</w:t>
-      </w:r>
-      <w:r>
-        <w:rPr>
-          <w:rFonts w:ascii="Cambria Math" w:cs="Cambria Math" w:eastAsia="Cambria Math" w:hAnsi="Cambria Math"/>
-          <w:sz w:val="23"/>
-          <w:szCs w:val="23"/>
-          <w:vertAlign w:val="superscript"/>
-        </w:rPr>
-        <w:t xml:space="preserve">2</w:t>
-      </w:r>
-      <w:r>
-        <w:rPr>
-          <w:rFonts w:ascii="Cambria Math" w:cs="Cambria Math" w:eastAsia="Cambria Math" w:hAnsi="Cambria Math"/>
-          <w:sz w:val="23"/>
-          <w:szCs w:val="23"/>
-        </w:rPr>
-        <w:t xml:space="preserve"> δ</w:t>
-      </w:r>
-      <w:r>
-        <w:rPr>
-          <w:rFonts w:ascii="Cambria Math" w:cs="Cambria Math" w:eastAsia="Cambria Math" w:hAnsi="Cambria Math"/>
-          <w:sz w:val="23"/>
-          <w:szCs w:val="23"/>
-          <w:vertAlign w:val="subscript"/>
-        </w:rPr>
-        <w:t xml:space="preserve">K</w:t>
-      </w:r>
-      <w:r>
-        <w:rPr>
-          <w:rFonts w:ascii="Cambria Math" w:cs="Cambria Math" w:eastAsia="Cambria Math" w:hAnsi="Cambria Math"/>
-          <w:sz w:val="23"/>
-          <w:szCs w:val="23"/>
-        </w:rPr>
-        <w:t xml:space="preserve">,    with F</w:t>
-      </w:r>
-      <w:r>
-        <w:rPr>
-          <w:rFonts w:ascii="Cambria Math" w:cs="Cambria Math" w:eastAsia="Cambria Math" w:hAnsi="Cambria Math"/>
-          <w:sz w:val="23"/>
-          <w:szCs w:val="23"/>
-          <w:vertAlign w:val="subscript"/>
-        </w:rPr>
-        <w:t xml:space="preserve">S</w:t>
-      </w:r>
-      <w:r>
-        <w:rPr>
-          <w:rFonts w:ascii="Cambria Math" w:cs="Cambria Math" w:eastAsia="Cambria Math" w:hAnsi="Cambria Math"/>
-          <w:sz w:val="23"/>
-          <w:szCs w:val="23"/>
-        </w:rPr>
-        <w:t xml:space="preserve"> = r</w:t>
-      </w:r>
-      <w:r>
-        <w:rPr>
-          <w:rFonts w:ascii="Cambria Math" w:cs="Cambria Math" w:eastAsia="Cambria Math" w:hAnsi="Cambria Math"/>
-          <w:sz w:val="23"/>
-          <w:szCs w:val="23"/>
-          <w:vertAlign w:val="subscript"/>
-        </w:rPr>
-        <w:t xml:space="preserve">S</w:t>
-      </w:r>
-      <w:r>
-        <w:rPr>
-          <w:rFonts w:ascii="Cambria Math" w:cs="Cambria Math" w:eastAsia="Cambria Math" w:hAnsi="Cambria Math"/>
-          <w:sz w:val="23"/>
-          <w:szCs w:val="23"/>
-        </w:rPr>
-        <w:t xml:space="preserve">[K̄(M) − K]</w:t>
-      </w:r>
-      <w:r>
-        <w:rPr>
-          <w:rFonts w:ascii="Cambria Math" w:cs="Cambria Math" w:eastAsia="Cambria Math" w:hAnsi="Cambria Math"/>
-          <w:sz w:val="23"/>
-          <w:szCs w:val="23"/>
-          <w:vertAlign w:val="subscript"/>
-        </w:rPr>
-        <w:t xml:space="preserve">+</w:t>
-      </w:r>
-      <w:r>
-        <w:rPr>
-          <w:rFonts w:ascii="Cambria Math" w:cs="Cambria Math" w:eastAsia="Cambria Math" w:hAnsi="Cambria Math"/>
-          <w:sz w:val="23"/>
-          <w:szCs w:val="23"/>
-        </w:rPr>
-        <w:t xml:space="preserve">,  F</w:t>
-      </w:r>
-      <w:r>
-        <w:rPr>
-          <w:rFonts w:ascii="Cambria Math" w:cs="Cambria Math" w:eastAsia="Cambria Math" w:hAnsi="Cambria Math"/>
-          <w:sz w:val="23"/>
-          <w:szCs w:val="23"/>
-          <w:vertAlign w:val="subscript"/>
-        </w:rPr>
-        <w:t xml:space="preserve">E</w:t>
-      </w:r>
-      <w:r>
-        <w:rPr>
-          <w:rFonts w:ascii="Cambria Math" w:cs="Cambria Math" w:eastAsia="Cambria Math" w:hAnsi="Cambria Math"/>
-          <w:sz w:val="23"/>
-          <w:szCs w:val="23"/>
-        </w:rPr>
-        <w:t xml:space="preserve"> = r</w:t>
-      </w:r>
-      <w:r>
-        <w:rPr>
-          <w:rFonts w:ascii="Cambria Math" w:cs="Cambria Math" w:eastAsia="Cambria Math" w:hAnsi="Cambria Math"/>
-          <w:sz w:val="23"/>
-          <w:szCs w:val="23"/>
-          <w:vertAlign w:val="subscript"/>
-        </w:rPr>
-        <w:t xml:space="preserve">E</w:t>
-      </w:r>
-      <w:r>
-        <w:rPr>
-          <w:rFonts w:ascii="Cambria Math" w:cs="Cambria Math" w:eastAsia="Cambria Math" w:hAnsi="Cambria Math"/>
-          <w:sz w:val="23"/>
-          <w:szCs w:val="23"/>
-        </w:rPr>
-        <w:t xml:space="preserve">(1 − K),  F</w:t>
-      </w:r>
-      <w:r>
-        <w:rPr>
-          <w:rFonts w:ascii="Cambria Math" w:cs="Cambria Math" w:eastAsia="Cambria Math" w:hAnsi="Cambria Math"/>
-          <w:sz w:val="23"/>
-          <w:szCs w:val="23"/>
-          <w:vertAlign w:val="subscript"/>
-        </w:rPr>
-        <w:t xml:space="preserve">T</w:t>
-      </w:r>
-      <w:r>
-        <w:rPr>
-          <w:rFonts w:ascii="Cambria Math" w:cs="Cambria Math" w:eastAsia="Cambria Math" w:hAnsi="Cambria Math"/>
-          <w:sz w:val="23"/>
-          <w:szCs w:val="23"/>
-        </w:rPr>
-        <w:t xml:space="preserve"> = e</w:t>
-      </w:r>
-      <w:r>
-        <w:rPr>
-          <w:rFonts w:ascii="Cambria Math" w:cs="Cambria Math" w:eastAsia="Cambria Math" w:hAnsi="Cambria Math"/>
-          <w:sz w:val="23"/>
-          <w:szCs w:val="23"/>
-          <w:vertAlign w:val="subscript"/>
-        </w:rPr>
-        <w:t xml:space="preserve">T</w:t>
-      </w:r>
-      <w:r>
-        <w:rPr>
-          <w:rFonts w:ascii="Cambria Math" w:cs="Cambria Math" w:eastAsia="Cambria Math" w:hAnsi="Cambria Math"/>
-          <w:sz w:val="23"/>
-          <w:szCs w:val="23"/>
-        </w:rPr>
-        <w:t xml:space="preserve">(1 − K)</w:t>
+        <w:t xml:space="preserve">integrated test</w:t>
+      </w:r>
+      <w:r>
+        <w:rPr>
+          <w:rFonts w:ascii="Calibri" w:cs="Calibri" w:eastAsia="Calibri" w:hAnsi="Calibri"/>
+        </w:rPr>
+        <w:t xml:space="preserve"> T (step 3).</w:t>
       </w:r>
     </w:p>
     <w:p>
@@ -6580,7 +6322,265 @@
         <w:rPr>
           <w:rFonts w:ascii="Calibri" w:cs="Calibri" w:eastAsia="Calibri" w:hAnsi="Calibri"/>
         </w:rPr>
-        <w:t xml:space="preserve">Screen the chosen activity against cost, schedule and exposure (step 6); if it fails, take the next best.</w:t>
+        <w:t xml:space="preserve">Otherwise (K &lt; K</w:t>
+      </w:r>
+      <w:r>
+        <w:rPr>
+          <w:rFonts w:ascii="Calibri" w:cs="Calibri" w:eastAsia="Calibri" w:hAnsi="Calibri"/>
+          <w:vertAlign w:val="subscript"/>
+        </w:rPr>
+        <w:t xml:space="preserve">req</w:t>
+      </w:r>
+      <w:r>
+        <w:rPr>
+          <w:rFonts w:ascii="Calibri" w:cs="Calibri" w:eastAsia="Calibri" w:hAnsi="Calibri"/>
+        </w:rPr>
+        <w:t xml:space="preserve">, K &lt; K</w:t>
+      </w:r>
+      <w:r>
+        <w:rPr>
+          <w:rFonts w:ascii="Calibri" w:cs="Calibri" w:eastAsia="Calibri" w:hAnsi="Calibri"/>
+          <w:vertAlign w:val="subscript"/>
+        </w:rPr>
+        <w:t xml:space="preserve">need</w:t>
+      </w:r>
+      <w:r>
+        <w:rPr>
+          <w:rFonts w:ascii="Calibri" w:cs="Calibri" w:eastAsia="Calibri" w:hAnsi="Calibri"/>
+        </w:rPr>
+        <w:t xml:space="preserve">, or the hazard is above the limit, step 3b): run the activity with the largest </w:t>
+      </w:r>
+      <w:r>
+        <w:rPr>
+          <w:rFonts w:ascii="Calibri" w:cs="Calibri" w:eastAsia="Calibri" w:hAnsi="Calibri"/>
+          <w:b/>
+          <w:bCs/>
+        </w:rPr>
+        <w:t xml:space="preserve">net knowledge rate</w:t>
+      </w:r>
+      <w:r>
+        <w:rPr>
+          <w:rFonts w:ascii="Calibri" w:cs="Calibri" w:eastAsia="Calibri" w:hAnsi="Calibri"/>
+        </w:rPr>
+        <w:t xml:space="preserve"> (step 4):</w:t>
+      </w:r>
+    </w:p>
+    <w:p>
+      <w:pPr>
+        <w:spacing w:after="120" w:before="80"/>
+        <w:jc w:val="center"/>
+      </w:pPr>
+      <w:r>
+        <w:rPr>
+          <w:rFonts w:ascii="Cambria Math" w:cs="Cambria Math" w:eastAsia="Cambria Math" w:hAnsi="Cambria Math"/>
+          <w:sz w:val="23"/>
+          <w:szCs w:val="23"/>
+        </w:rPr>
+        <w:t xml:space="preserve">net</w:t>
+      </w:r>
+      <w:r>
+        <w:rPr>
+          <w:rFonts w:ascii="Cambria Math" w:cs="Cambria Math" w:eastAsia="Cambria Math" w:hAnsi="Cambria Math"/>
+          <w:sz w:val="23"/>
+          <w:szCs w:val="23"/>
+          <w:vertAlign w:val="subscript"/>
+        </w:rPr>
+        <w:t xml:space="preserve">a</w:t>
+      </w:r>
+      <w:r>
+        <w:rPr>
+          <w:rFonts w:ascii="Cambria Math" w:cs="Cambria Math" w:eastAsia="Cambria Math" w:hAnsi="Cambria Math"/>
+          <w:sz w:val="23"/>
+          <w:szCs w:val="23"/>
+        </w:rPr>
+        <w:t xml:space="preserve"> = F</w:t>
+      </w:r>
+      <w:r>
+        <w:rPr>
+          <w:rFonts w:ascii="Cambria Math" w:cs="Cambria Math" w:eastAsia="Cambria Math" w:hAnsi="Cambria Math"/>
+          <w:sz w:val="23"/>
+          <w:szCs w:val="23"/>
+          <w:vertAlign w:val="subscript"/>
+        </w:rPr>
+        <w:t xml:space="preserve">a</w:t>
+      </w:r>
+      <w:r>
+        <w:rPr>
+          <w:rFonts w:ascii="Cambria Math" w:cs="Cambria Math" w:eastAsia="Cambria Math" w:hAnsi="Cambria Math"/>
+          <w:sz w:val="23"/>
+          <w:szCs w:val="23"/>
+        </w:rPr>
+        <w:t xml:space="preserve">(K, M) − λ</w:t>
+      </w:r>
+      <w:r>
+        <w:rPr>
+          <w:rFonts w:ascii="Cambria Math" w:cs="Cambria Math" w:eastAsia="Cambria Math" w:hAnsi="Cambria Math"/>
+          <w:sz w:val="23"/>
+          <w:szCs w:val="23"/>
+          <w:vertAlign w:val="subscript"/>
+        </w:rPr>
+        <w:t xml:space="preserve">a</w:t>
+      </w:r>
+      <w:r>
+        <w:rPr>
+          <w:rFonts w:ascii="Cambria Math" w:cs="Cambria Math" w:eastAsia="Cambria Math" w:hAnsi="Cambria Math"/>
+          <w:sz w:val="23"/>
+          <w:szCs w:val="23"/>
+        </w:rPr>
+        <w:t xml:space="preserve">(1 − K)</w:t>
+      </w:r>
+      <w:r>
+        <w:rPr>
+          <w:rFonts w:ascii="Cambria Math" w:cs="Cambria Math" w:eastAsia="Cambria Math" w:hAnsi="Cambria Math"/>
+          <w:sz w:val="23"/>
+          <w:szCs w:val="23"/>
+          <w:vertAlign w:val="superscript"/>
+        </w:rPr>
+        <w:t xml:space="preserve">2</w:t>
+      </w:r>
+      <w:r>
+        <w:rPr>
+          <w:rFonts w:ascii="Cambria Math" w:cs="Cambria Math" w:eastAsia="Cambria Math" w:hAnsi="Cambria Math"/>
+          <w:sz w:val="23"/>
+          <w:szCs w:val="23"/>
+        </w:rPr>
+        <w:t xml:space="preserve"> δ</w:t>
+      </w:r>
+      <w:r>
+        <w:rPr>
+          <w:rFonts w:ascii="Cambria Math" w:cs="Cambria Math" w:eastAsia="Cambria Math" w:hAnsi="Cambria Math"/>
+          <w:sz w:val="23"/>
+          <w:szCs w:val="23"/>
+          <w:vertAlign w:val="subscript"/>
+        </w:rPr>
+        <w:t xml:space="preserve">K</w:t>
+      </w:r>
+      <w:r>
+        <w:rPr>
+          <w:rFonts w:ascii="Cambria Math" w:cs="Cambria Math" w:eastAsia="Cambria Math" w:hAnsi="Cambria Math"/>
+          <w:sz w:val="23"/>
+          <w:szCs w:val="23"/>
+        </w:rPr>
+        <w:t xml:space="preserve">,    with F</w:t>
+      </w:r>
+      <w:r>
+        <w:rPr>
+          <w:rFonts w:ascii="Cambria Math" w:cs="Cambria Math" w:eastAsia="Cambria Math" w:hAnsi="Cambria Math"/>
+          <w:sz w:val="23"/>
+          <w:szCs w:val="23"/>
+          <w:vertAlign w:val="subscript"/>
+        </w:rPr>
+        <w:t xml:space="preserve">S</w:t>
+      </w:r>
+      <w:r>
+        <w:rPr>
+          <w:rFonts w:ascii="Cambria Math" w:cs="Cambria Math" w:eastAsia="Cambria Math" w:hAnsi="Cambria Math"/>
+          <w:sz w:val="23"/>
+          <w:szCs w:val="23"/>
+        </w:rPr>
+        <w:t xml:space="preserve"> = r</w:t>
+      </w:r>
+      <w:r>
+        <w:rPr>
+          <w:rFonts w:ascii="Cambria Math" w:cs="Cambria Math" w:eastAsia="Cambria Math" w:hAnsi="Cambria Math"/>
+          <w:sz w:val="23"/>
+          <w:szCs w:val="23"/>
+          <w:vertAlign w:val="subscript"/>
+        </w:rPr>
+        <w:t xml:space="preserve">S</w:t>
+      </w:r>
+      <w:r>
+        <w:rPr>
+          <w:rFonts w:ascii="Cambria Math" w:cs="Cambria Math" w:eastAsia="Cambria Math" w:hAnsi="Cambria Math"/>
+          <w:sz w:val="23"/>
+          <w:szCs w:val="23"/>
+        </w:rPr>
+        <w:t xml:space="preserve">[K̄(M) − K]</w:t>
+      </w:r>
+      <w:r>
+        <w:rPr>
+          <w:rFonts w:ascii="Cambria Math" w:cs="Cambria Math" w:eastAsia="Cambria Math" w:hAnsi="Cambria Math"/>
+          <w:sz w:val="23"/>
+          <w:szCs w:val="23"/>
+          <w:vertAlign w:val="subscript"/>
+        </w:rPr>
+        <w:t xml:space="preserve">+</w:t>
+      </w:r>
+      <w:r>
+        <w:rPr>
+          <w:rFonts w:ascii="Cambria Math" w:cs="Cambria Math" w:eastAsia="Cambria Math" w:hAnsi="Cambria Math"/>
+          <w:sz w:val="23"/>
+          <w:szCs w:val="23"/>
+        </w:rPr>
+        <w:t xml:space="preserve">,  F</w:t>
+      </w:r>
+      <w:r>
+        <w:rPr>
+          <w:rFonts w:ascii="Cambria Math" w:cs="Cambria Math" w:eastAsia="Cambria Math" w:hAnsi="Cambria Math"/>
+          <w:sz w:val="23"/>
+          <w:szCs w:val="23"/>
+          <w:vertAlign w:val="subscript"/>
+        </w:rPr>
+        <w:t xml:space="preserve">E</w:t>
+      </w:r>
+      <w:r>
+        <w:rPr>
+          <w:rFonts w:ascii="Cambria Math" w:cs="Cambria Math" w:eastAsia="Cambria Math" w:hAnsi="Cambria Math"/>
+          <w:sz w:val="23"/>
+          <w:szCs w:val="23"/>
+        </w:rPr>
+        <w:t xml:space="preserve"> = r</w:t>
+      </w:r>
+      <w:r>
+        <w:rPr>
+          <w:rFonts w:ascii="Cambria Math" w:cs="Cambria Math" w:eastAsia="Cambria Math" w:hAnsi="Cambria Math"/>
+          <w:sz w:val="23"/>
+          <w:szCs w:val="23"/>
+          <w:vertAlign w:val="subscript"/>
+        </w:rPr>
+        <w:t xml:space="preserve">E</w:t>
+      </w:r>
+      <w:r>
+        <w:rPr>
+          <w:rFonts w:ascii="Cambria Math" w:cs="Cambria Math" w:eastAsia="Cambria Math" w:hAnsi="Cambria Math"/>
+          <w:sz w:val="23"/>
+          <w:szCs w:val="23"/>
+        </w:rPr>
+        <w:t xml:space="preserve">(1 − K),  F</w:t>
+      </w:r>
+      <w:r>
+        <w:rPr>
+          <w:rFonts w:ascii="Cambria Math" w:cs="Cambria Math" w:eastAsia="Cambria Math" w:hAnsi="Cambria Math"/>
+          <w:sz w:val="23"/>
+          <w:szCs w:val="23"/>
+          <w:vertAlign w:val="subscript"/>
+        </w:rPr>
+        <w:t xml:space="preserve">T</w:t>
+      </w:r>
+      <w:r>
+        <w:rPr>
+          <w:rFonts w:ascii="Cambria Math" w:cs="Cambria Math" w:eastAsia="Cambria Math" w:hAnsi="Cambria Math"/>
+          <w:sz w:val="23"/>
+          <w:szCs w:val="23"/>
+        </w:rPr>
+        <w:t xml:space="preserve"> = e</w:t>
+      </w:r>
+      <w:r>
+        <w:rPr>
+          <w:rFonts w:ascii="Cambria Math" w:cs="Cambria Math" w:eastAsia="Cambria Math" w:hAnsi="Cambria Math"/>
+          <w:sz w:val="23"/>
+          <w:szCs w:val="23"/>
+          <w:vertAlign w:val="subscript"/>
+        </w:rPr>
+        <w:t xml:space="preserve">T</w:t>
+      </w:r>
+      <w:r>
+        <w:rPr>
+          <w:rFonts w:ascii="Cambria Math" w:cs="Cambria Math" w:eastAsia="Cambria Math" w:hAnsi="Cambria Math"/>
+          <w:sz w:val="23"/>
+          <w:szCs w:val="23"/>
+        </w:rPr>
+        <w:t xml:space="preserve">(1 − K)</w:t>
       </w:r>
     </w:p>
     <w:tbl>

</xml_diff>